<commit_message>
finishing the commits for the the DAta 401 folder
</commit_message>
<xml_diff>
--- a/Milestone_pt1.docx
+++ b/Milestone_pt1.docx
@@ -32,7 +32,21 @@
           <w:sz w:val="28"/>
           <w:szCs w:val="28"/>
         </w:rPr>
-        <w:t>Hourly Electrical Demand in the Tennessee Valley Authority (TVA) Region</w:t>
+        <w:t>Hourly Electrical Demand</w:t>
+      </w:r>
+      <w:r>
+        <w:rPr>
+          <w:sz w:val="28"/>
+          <w:szCs w:val="28"/>
+        </w:rPr>
+        <w:t xml:space="preserve"> and Generation</w:t>
+      </w:r>
+      <w:r>
+        <w:rPr>
+          <w:sz w:val="28"/>
+          <w:szCs w:val="28"/>
+        </w:rPr>
+        <w:t xml:space="preserve"> in the Tennessee Valley Authority (TVA) Region</w:t>
       </w:r>
     </w:p>
     <w:p>
@@ -207,7 +221,21 @@
         <w:rPr>
           <w:rFonts w:ascii="Times New Roman" w:hAnsi="Times New Roman" w:cs="Times New Roman"/>
         </w:rPr>
-        <w:t>This is worth investigating and getting a better understanding of because TVA provides a majority of power throughout Tennessee and a good number of the states surrounding Tennessee. This research will examine peak-demand periods and compare actual demand in forecasts with the electricity. Ultimately, this project will explore whether historical data about the consumption patterns can be used to predict future electrical demand.</w:t>
+        <w:t xml:space="preserve">This is worth investigating and getting a better understanding of because TVA provides </w:t>
+      </w:r>
+      <w:proofErr w:type="gramStart"/>
+      <w:r>
+        <w:rPr>
+          <w:rFonts w:ascii="Times New Roman" w:hAnsi="Times New Roman" w:cs="Times New Roman"/>
+        </w:rPr>
+        <w:t>a majority of</w:t>
+      </w:r>
+      <w:proofErr w:type="gramEnd"/>
+      <w:r>
+        <w:rPr>
+          <w:rFonts w:ascii="Times New Roman" w:hAnsi="Times New Roman" w:cs="Times New Roman"/>
+        </w:rPr>
+        <w:t xml:space="preserve"> power throughout Tennessee and a good number of the states surrounding Tennessee. This research will examine peak-demand periods and compare actual demand in forecasts with the electricity. Ultimately, this project will explore whether historical data about the consumption patterns can be used to predict future electrical demand.</w:t>
       </w:r>
     </w:p>
     <w:p>
@@ -248,13 +276,55 @@
         <w:rPr>
           <w:rFonts w:ascii="Times New Roman" w:hAnsi="Times New Roman" w:cs="Times New Roman"/>
         </w:rPr>
-        <w:t>Due to the nature of TVA, this affects a number of various industries, as TVA supplies power for the public, they are of the highest concern. However, healthcare, government, operational managers, and policy makers would want to know the things that are going on as all of those industries or jobs rely on their being power to the buildings and the people. The audience will probably know that they are supplied by TVA power. The first question that the audience might ask is “why do I not have power?”</w:t>
-      </w:r>
-      <w:r>
-        <w:rPr>
-          <w:rFonts w:ascii="Times New Roman" w:hAnsi="Times New Roman" w:cs="Times New Roman"/>
-        </w:rPr>
-        <w:t xml:space="preserve">, this would be the general public question. From there the other industries and people would have a greater desire to know why the power cut out or phased out for a brief amount of time. Within this setting charts will need to be clear and defined as to what they are used for and what the intent is to continue with the research. This will need to be displayed among the viewers so that they can best understand the purposes that are being sought after. </w:t>
+        <w:t xml:space="preserve">Due to the nature of TVA, this affects </w:t>
+      </w:r>
+      <w:proofErr w:type="gramStart"/>
+      <w:r>
+        <w:rPr>
+          <w:rFonts w:ascii="Times New Roman" w:hAnsi="Times New Roman" w:cs="Times New Roman"/>
+        </w:rPr>
+        <w:t>a number of</w:t>
+      </w:r>
+      <w:proofErr w:type="gramEnd"/>
+      <w:r>
+        <w:rPr>
+          <w:rFonts w:ascii="Times New Roman" w:hAnsi="Times New Roman" w:cs="Times New Roman"/>
+        </w:rPr>
+        <w:t xml:space="preserve"> various industries, as TVA supplies power for the public, they are of the highest concern. However, healthcare, government, operational managers, and policy makers would want to know the things that are going on as </w:t>
+      </w:r>
+      <w:proofErr w:type="gramStart"/>
+      <w:r>
+        <w:rPr>
+          <w:rFonts w:ascii="Times New Roman" w:hAnsi="Times New Roman" w:cs="Times New Roman"/>
+        </w:rPr>
+        <w:t>all of</w:t>
+      </w:r>
+      <w:proofErr w:type="gramEnd"/>
+      <w:r>
+        <w:rPr>
+          <w:rFonts w:ascii="Times New Roman" w:hAnsi="Times New Roman" w:cs="Times New Roman"/>
+        </w:rPr>
+        <w:t xml:space="preserve"> those industries or jobs rely on their being power to the buildings and the people. The audience will probably know that they are supplied by TVA power. The first question that the audience might ask is “why do I not have power?”</w:t>
+      </w:r>
+      <w:r>
+        <w:rPr>
+          <w:rFonts w:ascii="Times New Roman" w:hAnsi="Times New Roman" w:cs="Times New Roman"/>
+        </w:rPr>
+        <w:t xml:space="preserve">, this would be the </w:t>
+      </w:r>
+      <w:proofErr w:type="gramStart"/>
+      <w:r>
+        <w:rPr>
+          <w:rFonts w:ascii="Times New Roman" w:hAnsi="Times New Roman" w:cs="Times New Roman"/>
+        </w:rPr>
+        <w:t>general public</w:t>
+      </w:r>
+      <w:proofErr w:type="gramEnd"/>
+      <w:r>
+        <w:rPr>
+          <w:rFonts w:ascii="Times New Roman" w:hAnsi="Times New Roman" w:cs="Times New Roman"/>
+        </w:rPr>
+        <w:t xml:space="preserve"> question. From there the other industries and people would have a greater desire to know why the power cut out or phased out for a brief amount of time. Within this setting charts will need to be clear and defined as to what they are used for and what the intent is to continue with the research. This will need to be displayed among the viewers so that they can best understand the purposes that are being sought after. </w:t>
       </w:r>
     </w:p>
     <w:p>
@@ -282,7 +352,6 @@
           <w:sz w:val="40"/>
           <w:szCs w:val="40"/>
         </w:rPr>
-        <w:lastRenderedPageBreak/>
         <w:t xml:space="preserve">Part 2: Begin to Master the Data </w:t>
       </w:r>
     </w:p>
@@ -607,54 +676,78 @@
           </w:tcPr>
           <w:p>
             <w:pPr>
-              <w:rPr>
-                <w:rFonts w:ascii="Times New Roman" w:hAnsi="Times New Roman" w:cs="Times New Roman"/>
-                <w:b/>
-                <w:bCs/>
-              </w:rPr>
-            </w:pPr>
-          </w:p>
-        </w:tc>
-        <w:tc>
-          <w:tcPr>
-            <w:tcW w:w="1870" w:type="dxa"/>
-          </w:tcPr>
-          <w:p>
-            <w:pPr>
-              <w:rPr>
-                <w:rFonts w:ascii="Times New Roman" w:hAnsi="Times New Roman" w:cs="Times New Roman"/>
-                <w:b/>
-                <w:bCs/>
-              </w:rPr>
-            </w:pPr>
-          </w:p>
-        </w:tc>
-        <w:tc>
-          <w:tcPr>
-            <w:tcW w:w="1870" w:type="dxa"/>
-          </w:tcPr>
-          <w:p>
-            <w:pPr>
-              <w:rPr>
-                <w:rFonts w:ascii="Times New Roman" w:hAnsi="Times New Roman" w:cs="Times New Roman"/>
-                <w:b/>
-                <w:bCs/>
-              </w:rPr>
-            </w:pPr>
-          </w:p>
-        </w:tc>
-        <w:tc>
-          <w:tcPr>
-            <w:tcW w:w="1870" w:type="dxa"/>
-          </w:tcPr>
-          <w:p>
-            <w:pPr>
-              <w:rPr>
-                <w:rFonts w:ascii="Times New Roman" w:hAnsi="Times New Roman" w:cs="Times New Roman"/>
-                <w:b/>
-                <w:bCs/>
-              </w:rPr>
-            </w:pPr>
+              <w:jc w:val="center"/>
+              <w:rPr>
+                <w:rFonts w:ascii="Times New Roman" w:hAnsi="Times New Roman" w:cs="Times New Roman"/>
+              </w:rPr>
+            </w:pPr>
+            <w:r>
+              <w:rPr>
+                <w:rFonts w:ascii="Times New Roman" w:hAnsi="Times New Roman" w:cs="Times New Roman"/>
+              </w:rPr>
+              <w:t>Period</w:t>
+            </w:r>
+          </w:p>
+        </w:tc>
+        <w:tc>
+          <w:tcPr>
+            <w:tcW w:w="1870" w:type="dxa"/>
+          </w:tcPr>
+          <w:p>
+            <w:pPr>
+              <w:rPr>
+                <w:rFonts w:ascii="Times New Roman" w:hAnsi="Times New Roman" w:cs="Times New Roman"/>
+              </w:rPr>
+            </w:pPr>
+            <w:r>
+              <w:rPr>
+                <w:rFonts w:ascii="Times New Roman" w:hAnsi="Times New Roman" w:cs="Times New Roman"/>
+              </w:rPr>
+              <w:t xml:space="preserve">Hourly </w:t>
+            </w:r>
+            <w:r>
+              <w:rPr>
+                <w:rFonts w:ascii="Times New Roman" w:hAnsi="Times New Roman" w:cs="Times New Roman"/>
+              </w:rPr>
+              <w:t xml:space="preserve">record of the things happening in the TVA </w:t>
+            </w:r>
+          </w:p>
+        </w:tc>
+        <w:tc>
+          <w:tcPr>
+            <w:tcW w:w="1870" w:type="dxa"/>
+          </w:tcPr>
+          <w:p>
+            <w:pPr>
+              <w:jc w:val="center"/>
+              <w:rPr>
+                <w:rFonts w:ascii="Times New Roman" w:hAnsi="Times New Roman" w:cs="Times New Roman"/>
+              </w:rPr>
+            </w:pPr>
+            <w:r>
+              <w:rPr>
+                <w:rFonts w:ascii="Times New Roman" w:hAnsi="Times New Roman" w:cs="Times New Roman"/>
+              </w:rPr>
+              <w:t xml:space="preserve">String </w:t>
+            </w:r>
+          </w:p>
+        </w:tc>
+        <w:tc>
+          <w:tcPr>
+            <w:tcW w:w="1870" w:type="dxa"/>
+          </w:tcPr>
+          <w:p>
+            <w:pPr>
+              <w:rPr>
+                <w:rFonts w:ascii="Times New Roman" w:hAnsi="Times New Roman" w:cs="Times New Roman"/>
+              </w:rPr>
+            </w:pPr>
+            <w:r>
+              <w:rPr>
+                <w:rFonts w:ascii="Times New Roman" w:hAnsi="Times New Roman" w:cs="Times New Roman"/>
+              </w:rPr>
+              <w:t>2025-12-01T23</w:t>
+            </w:r>
           </w:p>
         </w:tc>
         <w:tc>
@@ -679,54 +772,74 @@
           </w:tcPr>
           <w:p>
             <w:pPr>
-              <w:rPr>
-                <w:rFonts w:ascii="Times New Roman" w:hAnsi="Times New Roman" w:cs="Times New Roman"/>
-                <w:b/>
-                <w:bCs/>
-              </w:rPr>
-            </w:pPr>
-          </w:p>
-        </w:tc>
-        <w:tc>
-          <w:tcPr>
-            <w:tcW w:w="1870" w:type="dxa"/>
-          </w:tcPr>
-          <w:p>
-            <w:pPr>
-              <w:rPr>
-                <w:rFonts w:ascii="Times New Roman" w:hAnsi="Times New Roman" w:cs="Times New Roman"/>
-                <w:b/>
-                <w:bCs/>
-              </w:rPr>
-            </w:pPr>
-          </w:p>
-        </w:tc>
-        <w:tc>
-          <w:tcPr>
-            <w:tcW w:w="1870" w:type="dxa"/>
-          </w:tcPr>
-          <w:p>
-            <w:pPr>
-              <w:rPr>
-                <w:rFonts w:ascii="Times New Roman" w:hAnsi="Times New Roman" w:cs="Times New Roman"/>
-                <w:b/>
-                <w:bCs/>
-              </w:rPr>
-            </w:pPr>
-          </w:p>
-        </w:tc>
-        <w:tc>
-          <w:tcPr>
-            <w:tcW w:w="1870" w:type="dxa"/>
-          </w:tcPr>
-          <w:p>
-            <w:pPr>
-              <w:rPr>
-                <w:rFonts w:ascii="Times New Roman" w:hAnsi="Times New Roman" w:cs="Times New Roman"/>
-                <w:b/>
-                <w:bCs/>
-              </w:rPr>
-            </w:pPr>
+              <w:jc w:val="center"/>
+              <w:rPr>
+                <w:rFonts w:ascii="Times New Roman" w:hAnsi="Times New Roman" w:cs="Times New Roman"/>
+              </w:rPr>
+            </w:pPr>
+            <w:r>
+              <w:rPr>
+                <w:rFonts w:ascii="Times New Roman" w:hAnsi="Times New Roman" w:cs="Times New Roman"/>
+              </w:rPr>
+              <w:t>Respondent</w:t>
+            </w:r>
+          </w:p>
+        </w:tc>
+        <w:tc>
+          <w:tcPr>
+            <w:tcW w:w="1870" w:type="dxa"/>
+          </w:tcPr>
+          <w:p>
+            <w:pPr>
+              <w:rPr>
+                <w:rFonts w:ascii="Times New Roman" w:hAnsi="Times New Roman" w:cs="Times New Roman"/>
+              </w:rPr>
+            </w:pPr>
+            <w:r>
+              <w:rPr>
+                <w:rFonts w:ascii="Times New Roman" w:hAnsi="Times New Roman" w:cs="Times New Roman"/>
+              </w:rPr>
+              <w:t>Short Name of what power company</w:t>
+            </w:r>
+          </w:p>
+        </w:tc>
+        <w:tc>
+          <w:tcPr>
+            <w:tcW w:w="1870" w:type="dxa"/>
+          </w:tcPr>
+          <w:p>
+            <w:pPr>
+              <w:jc w:val="center"/>
+              <w:rPr>
+                <w:rFonts w:ascii="Times New Roman" w:hAnsi="Times New Roman" w:cs="Times New Roman"/>
+                <w:b/>
+                <w:bCs/>
+              </w:rPr>
+            </w:pPr>
+            <w:r>
+              <w:rPr>
+                <w:rFonts w:ascii="Times New Roman" w:hAnsi="Times New Roman" w:cs="Times New Roman"/>
+              </w:rPr>
+              <w:t>String</w:t>
+            </w:r>
+          </w:p>
+        </w:tc>
+        <w:tc>
+          <w:tcPr>
+            <w:tcW w:w="1870" w:type="dxa"/>
+          </w:tcPr>
+          <w:p>
+            <w:pPr>
+              <w:rPr>
+                <w:rFonts w:ascii="Times New Roman" w:hAnsi="Times New Roman" w:cs="Times New Roman"/>
+              </w:rPr>
+            </w:pPr>
+            <w:r>
+              <w:rPr>
+                <w:rFonts w:ascii="Times New Roman" w:hAnsi="Times New Roman" w:cs="Times New Roman"/>
+              </w:rPr>
+              <w:t>TVA</w:t>
+            </w:r>
           </w:p>
         </w:tc>
         <w:tc>
@@ -751,54 +864,74 @@
           </w:tcPr>
           <w:p>
             <w:pPr>
-              <w:rPr>
-                <w:rFonts w:ascii="Times New Roman" w:hAnsi="Times New Roman" w:cs="Times New Roman"/>
-                <w:b/>
-                <w:bCs/>
-              </w:rPr>
-            </w:pPr>
-          </w:p>
-        </w:tc>
-        <w:tc>
-          <w:tcPr>
-            <w:tcW w:w="1870" w:type="dxa"/>
-          </w:tcPr>
-          <w:p>
-            <w:pPr>
-              <w:rPr>
-                <w:rFonts w:ascii="Times New Roman" w:hAnsi="Times New Roman" w:cs="Times New Roman"/>
-                <w:b/>
-                <w:bCs/>
-              </w:rPr>
-            </w:pPr>
-          </w:p>
-        </w:tc>
-        <w:tc>
-          <w:tcPr>
-            <w:tcW w:w="1870" w:type="dxa"/>
-          </w:tcPr>
-          <w:p>
-            <w:pPr>
-              <w:rPr>
-                <w:rFonts w:ascii="Times New Roman" w:hAnsi="Times New Roman" w:cs="Times New Roman"/>
-                <w:b/>
-                <w:bCs/>
-              </w:rPr>
-            </w:pPr>
-          </w:p>
-        </w:tc>
-        <w:tc>
-          <w:tcPr>
-            <w:tcW w:w="1870" w:type="dxa"/>
-          </w:tcPr>
-          <w:p>
-            <w:pPr>
-              <w:rPr>
-                <w:rFonts w:ascii="Times New Roman" w:hAnsi="Times New Roman" w:cs="Times New Roman"/>
-                <w:b/>
-                <w:bCs/>
-              </w:rPr>
-            </w:pPr>
+              <w:jc w:val="center"/>
+              <w:rPr>
+                <w:rFonts w:ascii="Times New Roman" w:hAnsi="Times New Roman" w:cs="Times New Roman"/>
+              </w:rPr>
+            </w:pPr>
+            <w:r>
+              <w:rPr>
+                <w:rFonts w:ascii="Times New Roman" w:hAnsi="Times New Roman" w:cs="Times New Roman"/>
+              </w:rPr>
+              <w:t>Respondent Name</w:t>
+            </w:r>
+          </w:p>
+        </w:tc>
+        <w:tc>
+          <w:tcPr>
+            <w:tcW w:w="1870" w:type="dxa"/>
+          </w:tcPr>
+          <w:p>
+            <w:pPr>
+              <w:rPr>
+                <w:rFonts w:ascii="Times New Roman" w:hAnsi="Times New Roman" w:cs="Times New Roman"/>
+              </w:rPr>
+            </w:pPr>
+            <w:r>
+              <w:rPr>
+                <w:rFonts w:ascii="Times New Roman" w:hAnsi="Times New Roman" w:cs="Times New Roman"/>
+              </w:rPr>
+              <w:t>Long Name of Power Company</w:t>
+            </w:r>
+          </w:p>
+        </w:tc>
+        <w:tc>
+          <w:tcPr>
+            <w:tcW w:w="1870" w:type="dxa"/>
+          </w:tcPr>
+          <w:p>
+            <w:pPr>
+              <w:jc w:val="center"/>
+              <w:rPr>
+                <w:rFonts w:ascii="Times New Roman" w:hAnsi="Times New Roman" w:cs="Times New Roman"/>
+                <w:b/>
+                <w:bCs/>
+              </w:rPr>
+            </w:pPr>
+            <w:r>
+              <w:rPr>
+                <w:rFonts w:ascii="Times New Roman" w:hAnsi="Times New Roman" w:cs="Times New Roman"/>
+              </w:rPr>
+              <w:t>String</w:t>
+            </w:r>
+          </w:p>
+        </w:tc>
+        <w:tc>
+          <w:tcPr>
+            <w:tcW w:w="1870" w:type="dxa"/>
+          </w:tcPr>
+          <w:p>
+            <w:pPr>
+              <w:rPr>
+                <w:rFonts w:ascii="Times New Roman" w:hAnsi="Times New Roman" w:cs="Times New Roman"/>
+              </w:rPr>
+            </w:pPr>
+            <w:r>
+              <w:rPr>
+                <w:rFonts w:ascii="Times New Roman" w:hAnsi="Times New Roman" w:cs="Times New Roman"/>
+              </w:rPr>
+              <w:t>Tennessee Valley Authority</w:t>
+            </w:r>
           </w:p>
         </w:tc>
         <w:tc>
@@ -823,54 +956,80 @@
           </w:tcPr>
           <w:p>
             <w:pPr>
-              <w:rPr>
-                <w:rFonts w:ascii="Times New Roman" w:hAnsi="Times New Roman" w:cs="Times New Roman"/>
-                <w:b/>
-                <w:bCs/>
-              </w:rPr>
-            </w:pPr>
-          </w:p>
-        </w:tc>
-        <w:tc>
-          <w:tcPr>
-            <w:tcW w:w="1870" w:type="dxa"/>
-          </w:tcPr>
-          <w:p>
-            <w:pPr>
-              <w:rPr>
-                <w:rFonts w:ascii="Times New Roman" w:hAnsi="Times New Roman" w:cs="Times New Roman"/>
-                <w:b/>
-                <w:bCs/>
-              </w:rPr>
-            </w:pPr>
-          </w:p>
-        </w:tc>
-        <w:tc>
-          <w:tcPr>
-            <w:tcW w:w="1870" w:type="dxa"/>
-          </w:tcPr>
-          <w:p>
-            <w:pPr>
-              <w:rPr>
-                <w:rFonts w:ascii="Times New Roman" w:hAnsi="Times New Roman" w:cs="Times New Roman"/>
-                <w:b/>
-                <w:bCs/>
-              </w:rPr>
-            </w:pPr>
-          </w:p>
-        </w:tc>
-        <w:tc>
-          <w:tcPr>
-            <w:tcW w:w="1870" w:type="dxa"/>
-          </w:tcPr>
-          <w:p>
-            <w:pPr>
-              <w:rPr>
-                <w:rFonts w:ascii="Times New Roman" w:hAnsi="Times New Roman" w:cs="Times New Roman"/>
-                <w:b/>
-                <w:bCs/>
-              </w:rPr>
-            </w:pPr>
+              <w:jc w:val="center"/>
+              <w:rPr>
+                <w:rFonts w:ascii="Times New Roman" w:hAnsi="Times New Roman" w:cs="Times New Roman"/>
+              </w:rPr>
+            </w:pPr>
+            <w:r>
+              <w:rPr>
+                <w:rFonts w:ascii="Times New Roman" w:hAnsi="Times New Roman" w:cs="Times New Roman"/>
+              </w:rPr>
+              <w:t>Type</w:t>
+            </w:r>
+          </w:p>
+        </w:tc>
+        <w:tc>
+          <w:tcPr>
+            <w:tcW w:w="1870" w:type="dxa"/>
+          </w:tcPr>
+          <w:p>
+            <w:pPr>
+              <w:rPr>
+                <w:rFonts w:ascii="Times New Roman" w:hAnsi="Times New Roman" w:cs="Times New Roman"/>
+              </w:rPr>
+            </w:pPr>
+            <w:r>
+              <w:rPr>
+                <w:rFonts w:ascii="Times New Roman" w:hAnsi="Times New Roman" w:cs="Times New Roman"/>
+              </w:rPr>
+              <w:t>Type of power used</w:t>
+            </w:r>
+            <w:r>
+              <w:rPr>
+                <w:rFonts w:ascii="Times New Roman" w:hAnsi="Times New Roman" w:cs="Times New Roman"/>
+              </w:rPr>
+              <w:t>, power in, power out, generated, transferred</w:t>
+            </w:r>
+          </w:p>
+        </w:tc>
+        <w:tc>
+          <w:tcPr>
+            <w:tcW w:w="1870" w:type="dxa"/>
+          </w:tcPr>
+          <w:p>
+            <w:pPr>
+              <w:jc w:val="center"/>
+              <w:rPr>
+                <w:rFonts w:ascii="Times New Roman" w:hAnsi="Times New Roman" w:cs="Times New Roman"/>
+                <w:b/>
+                <w:bCs/>
+              </w:rPr>
+            </w:pPr>
+            <w:r>
+              <w:rPr>
+                <w:rFonts w:ascii="Times New Roman" w:hAnsi="Times New Roman" w:cs="Times New Roman"/>
+              </w:rPr>
+              <w:t>String</w:t>
+            </w:r>
+          </w:p>
+        </w:tc>
+        <w:tc>
+          <w:tcPr>
+            <w:tcW w:w="1870" w:type="dxa"/>
+          </w:tcPr>
+          <w:p>
+            <w:pPr>
+              <w:rPr>
+                <w:rFonts w:ascii="Times New Roman" w:hAnsi="Times New Roman" w:cs="Times New Roman"/>
+              </w:rPr>
+            </w:pPr>
+            <w:r>
+              <w:rPr>
+                <w:rFonts w:ascii="Times New Roman" w:hAnsi="Times New Roman" w:cs="Times New Roman"/>
+              </w:rPr>
+              <w:t>D</w:t>
+            </w:r>
           </w:p>
         </w:tc>
         <w:tc>
@@ -895,54 +1054,74 @@
           </w:tcPr>
           <w:p>
             <w:pPr>
-              <w:rPr>
-                <w:rFonts w:ascii="Times New Roman" w:hAnsi="Times New Roman" w:cs="Times New Roman"/>
-                <w:b/>
-                <w:bCs/>
-              </w:rPr>
-            </w:pPr>
-          </w:p>
-        </w:tc>
-        <w:tc>
-          <w:tcPr>
-            <w:tcW w:w="1870" w:type="dxa"/>
-          </w:tcPr>
-          <w:p>
-            <w:pPr>
-              <w:rPr>
-                <w:rFonts w:ascii="Times New Roman" w:hAnsi="Times New Roman" w:cs="Times New Roman"/>
-                <w:b/>
-                <w:bCs/>
-              </w:rPr>
-            </w:pPr>
-          </w:p>
-        </w:tc>
-        <w:tc>
-          <w:tcPr>
-            <w:tcW w:w="1870" w:type="dxa"/>
-          </w:tcPr>
-          <w:p>
-            <w:pPr>
-              <w:rPr>
-                <w:rFonts w:ascii="Times New Roman" w:hAnsi="Times New Roman" w:cs="Times New Roman"/>
-                <w:b/>
-                <w:bCs/>
-              </w:rPr>
-            </w:pPr>
-          </w:p>
-        </w:tc>
-        <w:tc>
-          <w:tcPr>
-            <w:tcW w:w="1870" w:type="dxa"/>
-          </w:tcPr>
-          <w:p>
-            <w:pPr>
-              <w:rPr>
-                <w:rFonts w:ascii="Times New Roman" w:hAnsi="Times New Roman" w:cs="Times New Roman"/>
-                <w:b/>
-                <w:bCs/>
-              </w:rPr>
-            </w:pPr>
+              <w:jc w:val="center"/>
+              <w:rPr>
+                <w:rFonts w:ascii="Times New Roman" w:hAnsi="Times New Roman" w:cs="Times New Roman"/>
+              </w:rPr>
+            </w:pPr>
+            <w:r>
+              <w:rPr>
+                <w:rFonts w:ascii="Times New Roman" w:hAnsi="Times New Roman" w:cs="Times New Roman"/>
+              </w:rPr>
+              <w:t>Type-Name</w:t>
+            </w:r>
+          </w:p>
+        </w:tc>
+        <w:tc>
+          <w:tcPr>
+            <w:tcW w:w="1870" w:type="dxa"/>
+          </w:tcPr>
+          <w:p>
+            <w:pPr>
+              <w:rPr>
+                <w:rFonts w:ascii="Times New Roman" w:hAnsi="Times New Roman" w:cs="Times New Roman"/>
+              </w:rPr>
+            </w:pPr>
+            <w:r>
+              <w:rPr>
+                <w:rFonts w:ascii="Times New Roman" w:hAnsi="Times New Roman" w:cs="Times New Roman"/>
+              </w:rPr>
+              <w:t>Long Name of Type</w:t>
+            </w:r>
+          </w:p>
+        </w:tc>
+        <w:tc>
+          <w:tcPr>
+            <w:tcW w:w="1870" w:type="dxa"/>
+          </w:tcPr>
+          <w:p>
+            <w:pPr>
+              <w:jc w:val="center"/>
+              <w:rPr>
+                <w:rFonts w:ascii="Times New Roman" w:hAnsi="Times New Roman" w:cs="Times New Roman"/>
+                <w:b/>
+                <w:bCs/>
+              </w:rPr>
+            </w:pPr>
+            <w:r>
+              <w:rPr>
+                <w:rFonts w:ascii="Times New Roman" w:hAnsi="Times New Roman" w:cs="Times New Roman"/>
+              </w:rPr>
+              <w:t>String</w:t>
+            </w:r>
+          </w:p>
+        </w:tc>
+        <w:tc>
+          <w:tcPr>
+            <w:tcW w:w="1870" w:type="dxa"/>
+          </w:tcPr>
+          <w:p>
+            <w:pPr>
+              <w:rPr>
+                <w:rFonts w:ascii="Times New Roman" w:hAnsi="Times New Roman" w:cs="Times New Roman"/>
+              </w:rPr>
+            </w:pPr>
+            <w:r>
+              <w:rPr>
+                <w:rFonts w:ascii="Times New Roman" w:hAnsi="Times New Roman" w:cs="Times New Roman"/>
+              </w:rPr>
+              <w:t>Demand</w:t>
+            </w:r>
           </w:p>
         </w:tc>
         <w:tc>
@@ -967,54 +1146,68 @@
           </w:tcPr>
           <w:p>
             <w:pPr>
-              <w:rPr>
-                <w:rFonts w:ascii="Times New Roman" w:hAnsi="Times New Roman" w:cs="Times New Roman"/>
-                <w:b/>
-                <w:bCs/>
-              </w:rPr>
-            </w:pPr>
-          </w:p>
-        </w:tc>
-        <w:tc>
-          <w:tcPr>
-            <w:tcW w:w="1870" w:type="dxa"/>
-          </w:tcPr>
-          <w:p>
-            <w:pPr>
-              <w:rPr>
-                <w:rFonts w:ascii="Times New Roman" w:hAnsi="Times New Roman" w:cs="Times New Roman"/>
-                <w:b/>
-                <w:bCs/>
-              </w:rPr>
-            </w:pPr>
-          </w:p>
-        </w:tc>
-        <w:tc>
-          <w:tcPr>
-            <w:tcW w:w="1870" w:type="dxa"/>
-          </w:tcPr>
-          <w:p>
-            <w:pPr>
-              <w:rPr>
-                <w:rFonts w:ascii="Times New Roman" w:hAnsi="Times New Roman" w:cs="Times New Roman"/>
-                <w:b/>
-                <w:bCs/>
-              </w:rPr>
-            </w:pPr>
-          </w:p>
-        </w:tc>
-        <w:tc>
-          <w:tcPr>
-            <w:tcW w:w="1870" w:type="dxa"/>
-          </w:tcPr>
-          <w:p>
-            <w:pPr>
-              <w:rPr>
-                <w:rFonts w:ascii="Times New Roman" w:hAnsi="Times New Roman" w:cs="Times New Roman"/>
-                <w:b/>
-                <w:bCs/>
-              </w:rPr>
-            </w:pPr>
+              <w:jc w:val="center"/>
+              <w:rPr>
+                <w:rFonts w:ascii="Times New Roman" w:hAnsi="Times New Roman" w:cs="Times New Roman"/>
+              </w:rPr>
+            </w:pPr>
+            <w:r>
+              <w:rPr>
+                <w:rFonts w:ascii="Times New Roman" w:hAnsi="Times New Roman" w:cs="Times New Roman"/>
+              </w:rPr>
+              <w:t>Value</w:t>
+            </w:r>
+          </w:p>
+        </w:tc>
+        <w:tc>
+          <w:tcPr>
+            <w:tcW w:w="1870" w:type="dxa"/>
+          </w:tcPr>
+          <w:p>
+            <w:pPr>
+              <w:rPr>
+                <w:rFonts w:ascii="Times New Roman" w:hAnsi="Times New Roman" w:cs="Times New Roman"/>
+                <w:b/>
+                <w:bCs/>
+              </w:rPr>
+            </w:pPr>
+          </w:p>
+        </w:tc>
+        <w:tc>
+          <w:tcPr>
+            <w:tcW w:w="1870" w:type="dxa"/>
+          </w:tcPr>
+          <w:p>
+            <w:pPr>
+              <w:jc w:val="center"/>
+              <w:rPr>
+                <w:rFonts w:ascii="Times New Roman" w:hAnsi="Times New Roman" w:cs="Times New Roman"/>
+              </w:rPr>
+            </w:pPr>
+            <w:r>
+              <w:rPr>
+                <w:rFonts w:ascii="Times New Roman" w:hAnsi="Times New Roman" w:cs="Times New Roman"/>
+              </w:rPr>
+              <w:t>float64</w:t>
+            </w:r>
+          </w:p>
+        </w:tc>
+        <w:tc>
+          <w:tcPr>
+            <w:tcW w:w="1870" w:type="dxa"/>
+          </w:tcPr>
+          <w:p>
+            <w:pPr>
+              <w:rPr>
+                <w:rFonts w:ascii="Times New Roman" w:hAnsi="Times New Roman" w:cs="Times New Roman"/>
+              </w:rPr>
+            </w:pPr>
+            <w:r>
+              <w:rPr>
+                <w:rFonts w:ascii="Times New Roman" w:hAnsi="Times New Roman" w:cs="Times New Roman"/>
+              </w:rPr>
+              <w:t>22083.0</w:t>
+            </w:r>
           </w:p>
         </w:tc>
         <w:tc>
@@ -1039,54 +1232,70 @@
           </w:tcPr>
           <w:p>
             <w:pPr>
-              <w:rPr>
-                <w:rFonts w:ascii="Times New Roman" w:hAnsi="Times New Roman" w:cs="Times New Roman"/>
-                <w:b/>
-                <w:bCs/>
-              </w:rPr>
-            </w:pPr>
-          </w:p>
-        </w:tc>
-        <w:tc>
-          <w:tcPr>
-            <w:tcW w:w="1870" w:type="dxa"/>
-          </w:tcPr>
-          <w:p>
-            <w:pPr>
-              <w:rPr>
-                <w:rFonts w:ascii="Times New Roman" w:hAnsi="Times New Roman" w:cs="Times New Roman"/>
-                <w:b/>
-                <w:bCs/>
-              </w:rPr>
-            </w:pPr>
-          </w:p>
-        </w:tc>
-        <w:tc>
-          <w:tcPr>
-            <w:tcW w:w="1870" w:type="dxa"/>
-          </w:tcPr>
-          <w:p>
-            <w:pPr>
-              <w:rPr>
-                <w:rFonts w:ascii="Times New Roman" w:hAnsi="Times New Roman" w:cs="Times New Roman"/>
-                <w:b/>
-                <w:bCs/>
-              </w:rPr>
-            </w:pPr>
-          </w:p>
-        </w:tc>
-        <w:tc>
-          <w:tcPr>
-            <w:tcW w:w="1870" w:type="dxa"/>
-          </w:tcPr>
-          <w:p>
-            <w:pPr>
-              <w:rPr>
-                <w:rFonts w:ascii="Times New Roman" w:hAnsi="Times New Roman" w:cs="Times New Roman"/>
-                <w:b/>
-                <w:bCs/>
-              </w:rPr>
-            </w:pPr>
+              <w:jc w:val="center"/>
+              <w:rPr>
+                <w:rFonts w:ascii="Times New Roman" w:hAnsi="Times New Roman" w:cs="Times New Roman"/>
+              </w:rPr>
+            </w:pPr>
+            <w:r>
+              <w:rPr>
+                <w:rFonts w:ascii="Times New Roman" w:hAnsi="Times New Roman" w:cs="Times New Roman"/>
+              </w:rPr>
+              <w:t>Value-Units</w:t>
+            </w:r>
+          </w:p>
+        </w:tc>
+        <w:tc>
+          <w:tcPr>
+            <w:tcW w:w="1870" w:type="dxa"/>
+          </w:tcPr>
+          <w:p>
+            <w:pPr>
+              <w:rPr>
+                <w:rFonts w:ascii="Times New Roman" w:hAnsi="Times New Roman" w:cs="Times New Roman"/>
+                <w:b/>
+                <w:bCs/>
+              </w:rPr>
+            </w:pPr>
+          </w:p>
+        </w:tc>
+        <w:tc>
+          <w:tcPr>
+            <w:tcW w:w="1870" w:type="dxa"/>
+          </w:tcPr>
+          <w:p>
+            <w:pPr>
+              <w:jc w:val="center"/>
+              <w:rPr>
+                <w:rFonts w:ascii="Times New Roman" w:hAnsi="Times New Roman" w:cs="Times New Roman"/>
+              </w:rPr>
+            </w:pPr>
+            <w:r>
+              <w:rPr>
+                <w:rFonts w:ascii="Times New Roman" w:hAnsi="Times New Roman" w:cs="Times New Roman"/>
+              </w:rPr>
+              <w:t>string</w:t>
+            </w:r>
+          </w:p>
+        </w:tc>
+        <w:tc>
+          <w:tcPr>
+            <w:tcW w:w="1870" w:type="dxa"/>
+          </w:tcPr>
+          <w:p>
+            <w:pPr>
+              <w:rPr>
+                <w:rFonts w:ascii="Times New Roman" w:hAnsi="Times New Roman" w:cs="Times New Roman"/>
+              </w:rPr>
+            </w:pPr>
+            <w:proofErr w:type="spellStart"/>
+            <w:r>
+              <w:rPr>
+                <w:rFonts w:ascii="Times New Roman" w:hAnsi="Times New Roman" w:cs="Times New Roman"/>
+              </w:rPr>
+              <w:t>Megawatthours</w:t>
+            </w:r>
+            <w:proofErr w:type="spellEnd"/>
           </w:p>
         </w:tc>
         <w:tc>
@@ -1111,6 +1320,7 @@
           </w:tcPr>
           <w:p>
             <w:pPr>
+              <w:jc w:val="center"/>
               <w:rPr>
                 <w:rFonts w:ascii="Times New Roman" w:hAnsi="Times New Roman" w:cs="Times New Roman"/>
                 <w:b/>
@@ -1183,6 +1393,7 @@
           </w:tcPr>
           <w:p>
             <w:pPr>
+              <w:jc w:val="center"/>
               <w:rPr>
                 <w:rFonts w:ascii="Times New Roman" w:hAnsi="Times New Roman" w:cs="Times New Roman"/>
                 <w:b/>
@@ -1255,6 +1466,7 @@
           </w:tcPr>
           <w:p>
             <w:pPr>
+              <w:jc w:val="center"/>
               <w:rPr>
                 <w:rFonts w:ascii="Times New Roman" w:hAnsi="Times New Roman" w:cs="Times New Roman"/>
                 <w:b/>
@@ -1349,37 +1561,7 @@
           <w:sz w:val="40"/>
           <w:szCs w:val="40"/>
         </w:rPr>
-        <w:t xml:space="preserve">Part </w:t>
-      </w:r>
-      <w:r>
-        <w:rPr>
-          <w:rFonts w:ascii="Times New Roman" w:hAnsi="Times New Roman" w:cs="Times New Roman"/>
-          <w:b/>
-          <w:bCs/>
-          <w:sz w:val="40"/>
-          <w:szCs w:val="40"/>
-        </w:rPr>
-        <w:t>3</w:t>
-      </w:r>
-      <w:r>
-        <w:rPr>
-          <w:rFonts w:ascii="Times New Roman" w:hAnsi="Times New Roman" w:cs="Times New Roman"/>
-          <w:b/>
-          <w:bCs/>
-          <w:sz w:val="40"/>
-          <w:szCs w:val="40"/>
-        </w:rPr>
-        <w:t xml:space="preserve">: </w:t>
-      </w:r>
-      <w:r>
-        <w:rPr>
-          <w:rFonts w:ascii="Times New Roman" w:hAnsi="Times New Roman" w:cs="Times New Roman"/>
-          <w:b/>
-          <w:bCs/>
-          <w:sz w:val="40"/>
-          <w:szCs w:val="40"/>
-        </w:rPr>
-        <w:t>Preliminary Visualization Strategy</w:t>
+        <w:t>Part 3: Preliminary Visualization Strategy</w:t>
       </w:r>
     </w:p>
     <w:p>

</xml_diff>